<commit_message>
docs: restaurar estado de README v5.0 tras force push
Restaura exactamente el arbol documental de 277b41cc527cd439ea93c0890b21b134f963b271 sin reescribir main.

El estado anterior queda en codex/respaldo-antes-restaurar-20261028 y el historial original en codex/historial-original-readme-v5.
</commit_message>
<xml_diff>
--- a/alcance/alcance_v1.3_2026-10-13.docx
+++ b/alcance/alcance_v1.3_2026-10-13.docx
@@ -194,15 +194,6 @@
         </w:rPr>
         <w:t xml:space="preserve">Versión </w:t>
       </w:r>
-      <w:r>
-        <w:rPr>
-          <w:b/>
-          <w:color w:val="642138"/>
-          <w:sz w:val="22"/>
-          <w:lang w:val="es-EC"/>
-        </w:rPr>
-        <w:t xml:space="preserve">1.3 </w:t>
-      </w:r>
       <w:proofErr w:type="gramStart"/>
       <w:r>
         <w:rPr>
@@ -211,16 +202,7 @@
           <w:sz w:val="22"/>
           <w:lang w:val="es-EC"/>
         </w:rPr>
-        <w:t>|</w:t>
-      </w:r>
-      <w:r>
-        <w:rPr>
-          <w:b/>
-          <w:color w:val="642138"/>
-          <w:sz w:val="22"/>
-          <w:lang w:val="es-EC"/>
-        </w:rPr>
-        <w:t xml:space="preserve">  13</w:t>
+        <w:t>1.3  |</w:t>
       </w:r>
       <w:proofErr w:type="gramEnd"/>
       <w:r>
@@ -230,7 +212,7 @@
           <w:sz w:val="22"/>
           <w:lang w:val="es-EC"/>
         </w:rPr>
-        <w:t xml:space="preserve"> de octubre de 2026</w:t>
+        <w:t xml:space="preserve">  13 de octubre de 2026</w:t>
       </w:r>
     </w:p>
     <w:p>
@@ -304,35 +286,7 @@
         <w:tc>
           <w:tcPr>
             <w:tcW w:w="3053" w:type="dxa"/>
-            <w:shd w:val="clear" w:color="auto" w:fill="FFFFFF" w:themeFill="background1"/>
-            <w:tcMar>
-              <w:top w:w="70" w:type="dxa"/>
-              <w:left w:w="85" w:type="dxa"/>
-              <w:bottom w:w="70" w:type="dxa"/>
-              <w:right w:w="85" w:type="dxa"/>
-            </w:tcMar>
-          </w:tcPr>
-          <w:p>
-            <w:pPr>
-              <w:spacing w:after="20" w:line="245" w:lineRule="auto"/>
-              <w:rPr>
-                <w:color w:val="auto"/>
-              </w:rPr>
-            </w:pPr>
-            <w:r>
-              <w:rPr>
-                <w:b/>
-                <w:color w:val="auto"/>
-                <w:sz w:val="17"/>
-              </w:rPr>
-              <w:t>Código del documento</w:t>
-            </w:r>
-          </w:p>
-        </w:tc>
-        <w:tc>
-          <w:tcPr>
-            <w:tcW w:w="6840" w:type="dxa"/>
-            <w:shd w:val="clear" w:color="auto" w:fill="FFFFFF" w:themeFill="background1"/>
+            <w:shd w:val="clear" w:color="auto" w:fill="642138"/>
             <w:tcMar>
               <w:top w:w="70" w:type="dxa"/>
               <w:left w:w="85" w:type="dxa"/>
@@ -346,6 +300,31 @@
             </w:pPr>
             <w:r>
               <w:rPr>
+                <w:b/>
+                <w:color w:val="F0EAC8"/>
+                <w:sz w:val="17"/>
+              </w:rPr>
+              <w:t>Código del documento</w:t>
+            </w:r>
+          </w:p>
+        </w:tc>
+        <w:tc>
+          <w:tcPr>
+            <w:tcW w:w="6840" w:type="dxa"/>
+            <w:shd w:val="clear" w:color="auto" w:fill="FFFFFF"/>
+            <w:tcMar>
+              <w:top w:w="70" w:type="dxa"/>
+              <w:left w:w="85" w:type="dxa"/>
+              <w:bottom w:w="70" w:type="dxa"/>
+              <w:right w:w="85" w:type="dxa"/>
+            </w:tcMar>
+          </w:tcPr>
+          <w:p>
+            <w:pPr>
+              <w:spacing w:after="20" w:line="245" w:lineRule="auto"/>
+            </w:pPr>
+            <w:r>
+              <w:rPr>
                 <w:sz w:val="17"/>
               </w:rPr>
               <w:t>ZA-ALC-GEN-001</w:t>
@@ -360,35 +339,7 @@
         <w:tc>
           <w:tcPr>
             <w:tcW w:w="3053" w:type="dxa"/>
-            <w:shd w:val="clear" w:color="auto" w:fill="FFFFFF" w:themeFill="background1"/>
-            <w:tcMar>
-              <w:top w:w="70" w:type="dxa"/>
-              <w:left w:w="85" w:type="dxa"/>
-              <w:bottom w:w="70" w:type="dxa"/>
-              <w:right w:w="85" w:type="dxa"/>
-            </w:tcMar>
-          </w:tcPr>
-          <w:p>
-            <w:pPr>
-              <w:spacing w:after="20" w:line="245" w:lineRule="auto"/>
-              <w:rPr>
-                <w:color w:val="auto"/>
-              </w:rPr>
-            </w:pPr>
-            <w:r>
-              <w:rPr>
-                <w:b/>
-                <w:color w:val="auto"/>
-                <w:sz w:val="17"/>
-              </w:rPr>
-              <w:t>Módulo / alcance</w:t>
-            </w:r>
-          </w:p>
-        </w:tc>
-        <w:tc>
-          <w:tcPr>
-            <w:tcW w:w="6840" w:type="dxa"/>
-            <w:shd w:val="clear" w:color="auto" w:fill="FFFFFF" w:themeFill="background1"/>
+            <w:shd w:val="clear" w:color="auto" w:fill="642138"/>
             <w:tcMar>
               <w:top w:w="70" w:type="dxa"/>
               <w:left w:w="85" w:type="dxa"/>
@@ -402,6 +353,31 @@
             </w:pPr>
             <w:r>
               <w:rPr>
+                <w:b/>
+                <w:color w:val="F0EAC8"/>
+                <w:sz w:val="17"/>
+              </w:rPr>
+              <w:t>Módulo / alcance</w:t>
+            </w:r>
+          </w:p>
+        </w:tc>
+        <w:tc>
+          <w:tcPr>
+            <w:tcW w:w="6840" w:type="dxa"/>
+            <w:shd w:val="clear" w:color="auto" w:fill="F0EAC8"/>
+            <w:tcMar>
+              <w:top w:w="70" w:type="dxa"/>
+              <w:left w:w="85" w:type="dxa"/>
+              <w:bottom w:w="70" w:type="dxa"/>
+              <w:right w:w="85" w:type="dxa"/>
+            </w:tcMar>
+          </w:tcPr>
+          <w:p>
+            <w:pPr>
+              <w:spacing w:after="20" w:line="245" w:lineRule="auto"/>
+            </w:pPr>
+            <w:r>
+              <w:rPr>
                 <w:sz w:val="17"/>
               </w:rPr>
               <w:t>Alcance general del proyecto</w:t>
@@ -416,35 +392,7 @@
         <w:tc>
           <w:tcPr>
             <w:tcW w:w="3053" w:type="dxa"/>
-            <w:shd w:val="clear" w:color="auto" w:fill="FFFFFF" w:themeFill="background1"/>
-            <w:tcMar>
-              <w:top w:w="70" w:type="dxa"/>
-              <w:left w:w="85" w:type="dxa"/>
-              <w:bottom w:w="70" w:type="dxa"/>
-              <w:right w:w="85" w:type="dxa"/>
-            </w:tcMar>
-          </w:tcPr>
-          <w:p>
-            <w:pPr>
-              <w:spacing w:after="20" w:line="245" w:lineRule="auto"/>
-              <w:rPr>
-                <w:color w:val="auto"/>
-              </w:rPr>
-            </w:pPr>
-            <w:r>
-              <w:rPr>
-                <w:b/>
-                <w:color w:val="auto"/>
-                <w:sz w:val="17"/>
-              </w:rPr>
-              <w:t>Fase / entregable</w:t>
-            </w:r>
-          </w:p>
-        </w:tc>
-        <w:tc>
-          <w:tcPr>
-            <w:tcW w:w="6840" w:type="dxa"/>
-            <w:shd w:val="clear" w:color="auto" w:fill="FFFFFF" w:themeFill="background1"/>
+            <w:shd w:val="clear" w:color="auto" w:fill="642138"/>
             <w:tcMar>
               <w:top w:w="70" w:type="dxa"/>
               <w:left w:w="85" w:type="dxa"/>
@@ -458,6 +406,31 @@
             </w:pPr>
             <w:r>
               <w:rPr>
+                <w:b/>
+                <w:color w:val="F0EAC8"/>
+                <w:sz w:val="17"/>
+              </w:rPr>
+              <w:t>Fase / entregable</w:t>
+            </w:r>
+          </w:p>
+        </w:tc>
+        <w:tc>
+          <w:tcPr>
+            <w:tcW w:w="6840" w:type="dxa"/>
+            <w:shd w:val="clear" w:color="auto" w:fill="FFFFFF"/>
+            <w:tcMar>
+              <w:top w:w="70" w:type="dxa"/>
+              <w:left w:w="85" w:type="dxa"/>
+              <w:bottom w:w="70" w:type="dxa"/>
+              <w:right w:w="85" w:type="dxa"/>
+            </w:tcMar>
+          </w:tcPr>
+          <w:p>
+            <w:pPr>
+              <w:spacing w:after="20" w:line="245" w:lineRule="auto"/>
+            </w:pPr>
+            <w:r>
+              <w:rPr>
                 <w:sz w:val="17"/>
               </w:rPr>
               <w:t>Requisitos y diseño — Sprint 1</w:t>
@@ -472,7 +445,7 @@
         <w:tc>
           <w:tcPr>
             <w:tcW w:w="3053" w:type="dxa"/>
-            <w:shd w:val="clear" w:color="auto" w:fill="FFFFFF" w:themeFill="background1"/>
+            <w:shd w:val="clear" w:color="auto" w:fill="642138"/>
             <w:tcMar>
               <w:top w:w="70" w:type="dxa"/>
               <w:left w:w="85" w:type="dxa"/>
@@ -483,14 +456,11 @@
           <w:p>
             <w:pPr>
               <w:spacing w:after="20" w:line="245" w:lineRule="auto"/>
-              <w:rPr>
-                <w:color w:val="auto"/>
-              </w:rPr>
             </w:pPr>
             <w:r>
               <w:rPr>
                 <w:b/>
-                <w:color w:val="auto"/>
+                <w:color w:val="F0EAC8"/>
                 <w:sz w:val="17"/>
               </w:rPr>
               <w:t>Versión / fecha</w:t>
@@ -500,7 +470,7 @@
         <w:tc>
           <w:tcPr>
             <w:tcW w:w="6840" w:type="dxa"/>
-            <w:shd w:val="clear" w:color="auto" w:fill="FFFFFF" w:themeFill="background1"/>
+            <w:shd w:val="clear" w:color="auto" w:fill="F0EAC8"/>
             <w:tcMar>
               <w:top w:w="70" w:type="dxa"/>
               <w:left w:w="85" w:type="dxa"/>
@@ -511,29 +481,12 @@
           <w:p>
             <w:pPr>
               <w:spacing w:after="20" w:line="245" w:lineRule="auto"/>
-              <w:rPr>
-                <w:lang w:val="es-EC"/>
-              </w:rPr>
             </w:pPr>
             <w:r>
               <w:rPr>
                 <w:sz w:val="17"/>
               </w:rPr>
-              <w:t xml:space="preserve">v1.3 — 13 de </w:t>
-            </w:r>
-            <w:proofErr w:type="spellStart"/>
-            <w:r>
-              <w:rPr>
-                <w:sz w:val="17"/>
-              </w:rPr>
-              <w:t>octubre</w:t>
-            </w:r>
-            <w:proofErr w:type="spellEnd"/>
-            <w:r>
-              <w:rPr>
-                <w:sz w:val="17"/>
-              </w:rPr>
-              <w:t xml:space="preserve"> de 2026</w:t>
+              <w:t>v1.3 — 13 de octubre de 2026</w:t>
             </w:r>
           </w:p>
         </w:tc>
@@ -545,7 +498,7 @@
         <w:tc>
           <w:tcPr>
             <w:tcW w:w="3053" w:type="dxa"/>
-            <w:shd w:val="clear" w:color="auto" w:fill="FFFFFF" w:themeFill="background1"/>
+            <w:shd w:val="clear" w:color="auto" w:fill="642138"/>
             <w:tcMar>
               <w:top w:w="70" w:type="dxa"/>
               <w:left w:w="85" w:type="dxa"/>
@@ -556,14 +509,11 @@
           <w:p>
             <w:pPr>
               <w:spacing w:after="20" w:line="245" w:lineRule="auto"/>
-              <w:rPr>
-                <w:color w:val="auto"/>
-              </w:rPr>
             </w:pPr>
             <w:r>
               <w:rPr>
                 <w:b/>
-                <w:color w:val="auto"/>
+                <w:color w:val="F0EAC8"/>
                 <w:sz w:val="17"/>
               </w:rPr>
               <w:t>Autor / analista</w:t>
@@ -573,7 +523,7 @@
         <w:tc>
           <w:tcPr>
             <w:tcW w:w="6840" w:type="dxa"/>
-            <w:shd w:val="clear" w:color="auto" w:fill="FFFFFF" w:themeFill="background1"/>
+            <w:shd w:val="clear" w:color="auto" w:fill="FFFFFF"/>
             <w:tcMar>
               <w:top w:w="70" w:type="dxa"/>
               <w:left w:w="85" w:type="dxa"/>
@@ -605,7 +555,7 @@
         <w:tc>
           <w:tcPr>
             <w:tcW w:w="3053" w:type="dxa"/>
-            <w:shd w:val="clear" w:color="auto" w:fill="FFFFFF" w:themeFill="background1"/>
+            <w:shd w:val="clear" w:color="auto" w:fill="642138"/>
             <w:tcMar>
               <w:top w:w="70" w:type="dxa"/>
               <w:left w:w="85" w:type="dxa"/>
@@ -616,14 +566,11 @@
           <w:p>
             <w:pPr>
               <w:spacing w:after="20" w:line="245" w:lineRule="auto"/>
-              <w:rPr>
-                <w:color w:val="auto"/>
-              </w:rPr>
             </w:pPr>
             <w:r>
               <w:rPr>
                 <w:b/>
-                <w:color w:val="auto"/>
+                <w:color w:val="F0EAC8"/>
                 <w:sz w:val="17"/>
               </w:rPr>
               <w:t>Estado</w:t>
@@ -633,7 +580,7 @@
         <w:tc>
           <w:tcPr>
             <w:tcW w:w="6840" w:type="dxa"/>
-            <w:shd w:val="clear" w:color="auto" w:fill="FFFFFF" w:themeFill="background1"/>
+            <w:shd w:val="clear" w:color="auto" w:fill="F0EAC8"/>
             <w:tcMar>
               <w:top w:w="70" w:type="dxa"/>
               <w:left w:w="85" w:type="dxa"/>

</xml_diff>